<commit_message>
Generador automatico: inserta imagenes en Word + actualiza README
</commit_message>
<xml_diff>
--- a/docs/JCCP_Web_Act6.docx
+++ b/docs/JCCP_Web_Act6.docx
@@ -2477,9 +2477,6 @@
         <w:t>Capturas de pantalla:</w:t>
       </w:r>
     </w:p>
-    <w:p/>
-    <w:p/>
-    <w:p/>
     <w:p>
       <w:pPr>
         <w:pStyle w:val="Heading1"/>
@@ -2504,9 +2501,6 @@
         <w:t>Capturas de pantalla:</w:t>
       </w:r>
     </w:p>
-    <w:p/>
-    <w:p/>
-    <w:p/>
     <w:p>
       <w:pPr>
         <w:pStyle w:val="Heading1"/>
@@ -2531,9 +2525,6 @@
         <w:t>Capturas de pantalla:</w:t>
       </w:r>
     </w:p>
-    <w:p/>
-    <w:p/>
-    <w:p/>
     <w:p>
       <w:pPr>
         <w:pStyle w:val="Heading1"/>
@@ -2558,9 +2549,6 @@
         <w:t>Capturas de pantalla:</w:t>
       </w:r>
     </w:p>
-    <w:p/>
-    <w:p/>
-    <w:p/>
     <w:p>
       <w:pPr>
         <w:pStyle w:val="Heading1"/>
@@ -2585,9 +2573,6 @@
         <w:t>Capturas de pantalla:</w:t>
       </w:r>
     </w:p>
-    <w:p/>
-    <w:p/>
-    <w:p/>
     <w:p>
       <w:pPr>
         <w:pStyle w:val="Heading1"/>
@@ -2612,9 +2597,6 @@
         <w:t>Capturas de pantalla:</w:t>
       </w:r>
     </w:p>
-    <w:p/>
-    <w:p/>
-    <w:p/>
     <w:p>
       <w:pPr>
         <w:pStyle w:val="Heading1"/>
@@ -2639,9 +2621,6 @@
         <w:t>Capturas de pantalla:</w:t>
       </w:r>
     </w:p>
-    <w:p/>
-    <w:p/>
-    <w:p/>
     <w:p>
       <w:pPr>
         <w:pStyle w:val="Heading1"/>
@@ -2666,9 +2645,6 @@
         <w:t>Capturas de pantalla:</w:t>
       </w:r>
     </w:p>
-    <w:p/>
-    <w:p/>
-    <w:p/>
     <w:p>
       <w:pPr>
         <w:pStyle w:val="Heading1"/>
@@ -2693,9 +2669,6 @@
         <w:t>Capturas de pantalla:</w:t>
       </w:r>
     </w:p>
-    <w:p/>
-    <w:p/>
-    <w:p/>
     <w:p>
       <w:pPr>
         <w:pStyle w:val="Heading1"/>
@@ -2720,9 +2693,42 @@
         <w:t>Capturas de pantalla:</w:t>
       </w:r>
     </w:p>
-    <w:p/>
-    <w:p/>
-    <w:p/>
+    <w:p>
+      <w:r>
+        <w:drawing>
+          <wp:inline>
+            <wp:extent cx="5400000" cy="2385000"/>
+            <wp:docPr id="18" name="Picture 18"/>
+            <wp:cNvGraphicFramePr>
+              <a:graphicFrameLocks noChangeAspect="1"/>
+            </wp:cNvGraphicFramePr>
+            <a:graphic>
+              <a:graphicData uri="http://schemas.openxmlformats.org/drawingml/2006/picture">
+                <pic:pic>
+                  <pic:nvPicPr>
+                    <pic:cNvPr id="0" name="practica20.png"/>
+                    <pic:cNvPicPr/>
+                  </pic:nvPicPr>
+                  <pic:blipFill>
+                    <a:blip r:embed="rId32"/>
+                    <a:stretch>
+                      <a:fillRect/>
+                    </a:stretch>
+                  </pic:blipFill>
+                  <pic:spPr>
+                    <a:xfrm>
+                      <a:off x="0" y="0"/>
+                      <a:ext cx="5400000" cy="2385000"/>
+                    </a:xfrm>
+                    <a:prstGeom prst="rect"/>
+                  </pic:spPr>
+                </pic:pic>
+              </a:graphicData>
+            </a:graphic>
+          </wp:inline>
+        </w:drawing>
+      </w:r>
+    </w:p>
     <w:sectPr>
       <w:pgSz w:h="15840" w:w="12240" w:orient="portrait"/>
       <w:pgMar w:bottom="1440" w:top="1440" w:left="1440" w:right="1440" w:header="708" w:footer="708"/>

</xml_diff>